<commit_message>
Align design document with Deliverable 1 rubric requirements
Adds a dedicated Impact Measurement subsection (1-2 paragraphs, tied directly to the stated Goals) that the rubric requires separately from the problem statement - previously only implied via a Goals status table.

Rewrites Data Sources, Feature Engineering, Model Monitoring, and Model CI/CD from bullet lists into the requested two-to-three-paragraph prose format, preserving every fact and adding explicit rationale for each design decision (why WAPE over MAPE, why exclude Demand Forecast/Inventory Level/Units Ordered, why fit scalers only on train, why the CI workflow was restructured, why segment forecast-accuracy monitoring by store/category/region).
</commit_message>
<xml_diff>
--- a/docs/DESIGN_DOCUMENT.docx
+++ b/docs/DESIGN_DOCUMENT.docx
@@ -906,6 +906,142 @@
           <w:b/>
           <w:spacing w:val="0"/>
         </w:rPr>
+        <w:t xml:space="preserve">Impact Measurement</w:t>
+      </w:r>
+    </w:p>
+    <w:p>
+      <w:pPr>
+        <w:spacing w:after="293"/>
+      </w:pPr>
+      <w:r>
+        <w:rPr>
+          <w:rFonts w:ascii="Arial" w:hAnsi="Arial" w:cs="Arial"/>
+          <w:sz w:val="29"/>
+          <w:sz-cs w:val="29"/>
+          <w:spacing w:val="0"/>
+        </w:rPr>
+        <w:t xml:space="preserve">Impact is measured against the business goal stated above — reducing the forecasting error that drives both stockouts and excess inventory — using </w:t>
+      </w:r>
+      <w:r>
+        <w:rPr>
+          <w:rFonts w:ascii="Arial" w:hAnsi="Arial" w:cs="Arial"/>
+          <w:sz w:val="29"/>
+          <w:sz-cs w:val="29"/>
+          <w:b/>
+          <w:spacing w:val="0"/>
+        </w:rPr>
+        <w:t xml:space="preserve">WAPE (Weighted Absolute Percentage Error)</w:t>
+      </w:r>
+      <w:r>
+        <w:rPr>
+          <w:rFonts w:ascii="Arial" w:hAnsi="Arial" w:cs="Arial"/>
+          <w:sz w:val="29"/>
+          <w:sz-cs w:val="29"/>
+          <w:spacing w:val="0"/>
+        </w:rPr>
+        <w:t xml:space="preserve"> as the primary metric, with MAE and RMSE reported alongside and sMAPE as a supplementary check. WAPE was chosen specifically because it stays well-defined across the many low-volume store/product/day rows in this dataset, where a metric like MAPE would be dominated by division-by-near-zero noise; this matters for the business goal because a metric that misbehaves on low-volume combinations would mask exactly the segments most prone to stockouts. Success is defined relative to a </w:t>
+      </w:r>
+      <w:r>
+        <w:rPr>
+          <w:rFonts w:ascii="Arial" w:hAnsi="Arial" w:cs="Arial"/>
+          <w:sz w:val="29"/>
+          <w:sz-cs w:val="29"/>
+          <w:b/>
+          <w:spacing w:val="0"/>
+        </w:rPr>
+        <w:t xml:space="preserve">seasonal-naive baseline</w:t>
+      </w:r>
+      <w:r>
+        <w:rPr>
+          <w:rFonts w:ascii="Arial" w:hAnsi="Arial" w:cs="Arial"/>
+          <w:sz w:val="29"/>
+          <w:sz-cs w:val="29"/>
+          <w:spacing w:val="0"/>
+        </w:rPr>
+        <w:t xml:space="preserve"> (predicting the value from 7 days earlier) rather than an absolute error target, because the business question is "does this model add value over the simplest possible forecasting approach," not "is the error below some arbitrary number" — the latter would be meaningless without knowing how hard this specific dataset is to forecast.</w:t>
+      </w:r>
+    </w:p>
+    <w:p>
+      <w:pPr>
+        <w:spacing w:after="293"/>
+      </w:pPr>
+      <w:r>
+        <w:rPr>
+          <w:rFonts w:ascii="Arial" w:hAnsi="Arial" w:cs="Arial"/>
+          <w:sz w:val="29"/>
+          <w:sz-cs w:val="29"/>
+          <w:spacing w:val="0"/>
+        </w:rPr>
+        <w:t xml:space="preserve">Concretely, the project's quality gate operationalizes this measurement: a candidate model must achieve a test-set WAPE at or below 0.70 </w:t>
+      </w:r>
+      <w:r>
+        <w:rPr>
+          <w:rFonts w:ascii="Arial" w:hAnsi="Arial" w:cs="Arial"/>
+          <w:sz w:val="29"/>
+          <w:sz-cs w:val="29"/>
+          <w:b/>
+          <w:spacing w:val="0"/>
+        </w:rPr>
+        <w:t xml:space="preserve">and</w:t>
+      </w:r>
+      <w:r>
+        <w:rPr>
+          <w:rFonts w:ascii="Arial" w:hAnsi="Arial" w:cs="Arial"/>
+          <w:sz w:val="29"/>
+          <w:sz-cs w:val="29"/>
+          <w:spacing w:val="0"/>
+        </w:rPr>
+        <w:t xml:space="preserve"> at least a 10% relative WAPE improvement over the seasonal-naive baseline before it is allowed to register in the Model Registry (configured in </w:t>
+      </w:r>
+      <w:r>
+        <w:rPr>
+          <w:rFonts w:ascii="Courier" w:hAnsi="Courier" w:cs="Courier"/>
+          <w:sz w:val="29"/>
+          <w:sz-cs w:val="29"/>
+          <w:spacing w:val="0"/>
+        </w:rPr>
+        <w:t xml:space="preserve">config.yaml: training.quality_gates</w:t>
+      </w:r>
+      <w:r>
+        <w:rPr>
+          <w:rFonts w:ascii="Arial" w:hAnsi="Arial" w:cs="Arial"/>
+          <w:sz w:val="29"/>
+          <w:sz-cs w:val="29"/>
+          <w:spacing w:val="0"/>
+        </w:rPr>
+        <w:t xml:space="preserve"> and enforced identically in </w:t>
+      </w:r>
+      <w:r>
+        <w:rPr>
+          <w:rFonts w:ascii="Courier" w:hAnsi="Courier" w:cs="Courier"/>
+          <w:sz w:val="29"/>
+          <w:sz-cs w:val="29"/>
+          <w:spacing w:val="0"/>
+        </w:rPr>
+        <w:t xml:space="preserve">src/aws/sagemaker/pipeline_scripts/evaluate.py</w:t>
+      </w:r>
+      <w:r>
+        <w:rPr>
+          <w:rFonts w:ascii="Arial" w:hAnsi="Arial" w:cs="Arial"/>
+          <w:sz w:val="29"/>
+          <w:sz-cs w:val="29"/>
+          <w:spacing w:val="0"/>
+        </w:rPr>
+        <w:t xml:space="preserve">). The selected LSTM model achieved a test WAPE of 0.644 versus 0.868 for the baseline — a 25.9% MAE improvement — which both clears the gate and gives a concrete, falsifiable number tied directly to the stated goal of measurably reducing forecast error, rather than a vague claim of "the model works."</w:t>
+      </w:r>
+    </w:p>
+    <w:p>
+      <w:pPr>
+        <w:spacing w:after="346"/>
+      </w:pPr>
+      <w:r>
+        <w:rPr>
+          <w:rFonts w:ascii="Arial" w:hAnsi="Arial" w:cs="Arial"/>
+          <w:sz w:val="34"/>
+          <w:sz-cs w:val="34"/>
+          <w:b/>
+          <w:spacing w:val="0"/>
+        </w:rPr>
         <w:t xml:space="preserve">Goals vs Non-Goals</w:t>
       </w:r>
     </w:p>
@@ -1868,33 +2004,98 @@
           <w:sz-cs w:val="29"/>
           <w:spacing w:val="0"/>
         </w:rPr>
-        <w:t xml:space="preserve">Confirmed against the downloaded dataset (superseding the "must be confirmed" language in Deliverable 1):</w:t>
-      </w:r>
-    </w:p>
-    <w:p>
-      <w:pPr>
-        <w:ind w:left="720" w:first-line="-720"/>
-      </w:pPr>
-      <w:r>
-        <w:rPr>
-          <w:rFonts w:ascii="Arial" w:hAnsi="Arial" w:cs="Arial"/>
-          <w:sz w:val="29"/>
-          <w:sz-cs w:val="29"/>
-        </w:rPr>
-        <w:t xml:space="preserve"/>
-        <w:tab/>
-        <w:t xml:space="preserve">•</w:t>
-        <w:tab/>
-        <w:t xml:space="preserve"/>
-      </w:r>
-      <w:r>
-        <w:rPr>
-          <w:rFonts w:ascii="Arial" w:hAnsi="Arial" w:cs="Arial"/>
-          <w:sz w:val="29"/>
-          <w:sz-cs w:val="29"/>
-          <w:spacing w:val="0"/>
-        </w:rPr>
-        <w:t xml:space="preserve">Single file, </w:t>
+        <w:t xml:space="preserve">Deliverable 1 flagged that the exact files, row counts, and date coverage of the Kaggle dataset would need to be confirmed by profiling once downloaded, since the README's original description assumed separate </w:t>
+      </w:r>
+      <w:r>
+        <w:rPr>
+          <w:rFonts w:ascii="Courier" w:hAnsi="Courier" w:cs="Courier"/>
+          <w:sz w:val="29"/>
+          <w:sz-cs w:val="29"/>
+          <w:spacing w:val="0"/>
+        </w:rPr>
+        <w:t xml:space="preserve">train.csv</w:t>
+      </w:r>
+      <w:r>
+        <w:rPr>
+          <w:rFonts w:ascii="Arial" w:hAnsi="Arial" w:cs="Arial"/>
+          <w:sz w:val="29"/>
+          <w:sz-cs w:val="29"/>
+          <w:spacing w:val="0"/>
+        </w:rPr>
+        <w:t xml:space="preserve">/</w:t>
+      </w:r>
+      <w:r>
+        <w:rPr>
+          <w:rFonts w:ascii="Courier" w:hAnsi="Courier" w:cs="Courier"/>
+          <w:sz w:val="29"/>
+          <w:sz-cs w:val="29"/>
+          <w:spacing w:val="0"/>
+        </w:rPr>
+        <w:t xml:space="preserve">test.csv</w:t>
+      </w:r>
+      <w:r>
+        <w:rPr>
+          <w:rFonts w:ascii="Arial" w:hAnsi="Arial" w:cs="Arial"/>
+          <w:sz w:val="29"/>
+          <w:sz-cs w:val="29"/>
+          <w:spacing w:val="0"/>
+        </w:rPr>
+        <w:t xml:space="preserve">/</w:t>
+      </w:r>
+      <w:r>
+        <w:rPr>
+          <w:rFonts w:ascii="Courier" w:hAnsi="Courier" w:cs="Courier"/>
+          <w:sz w:val="29"/>
+          <w:sz-cs w:val="29"/>
+          <w:spacing w:val="0"/>
+        </w:rPr>
+        <w:t xml:space="preserve">stores.csv</w:t>
+      </w:r>
+      <w:r>
+        <w:rPr>
+          <w:rFonts w:ascii="Arial" w:hAnsi="Arial" w:cs="Arial"/>
+          <w:sz w:val="29"/>
+          <w:sz-cs w:val="29"/>
+          <w:spacing w:val="0"/>
+        </w:rPr>
+        <w:t xml:space="preserve">/</w:t>
+      </w:r>
+      <w:r>
+        <w:rPr>
+          <w:rFonts w:ascii="Courier" w:hAnsi="Courier" w:cs="Courier"/>
+          <w:sz w:val="29"/>
+          <w:sz-cs w:val="29"/>
+          <w:spacing w:val="0"/>
+        </w:rPr>
+        <w:t xml:space="preserve">items.csv</w:t>
+      </w:r>
+      <w:r>
+        <w:rPr>
+          <w:rFonts w:ascii="Arial" w:hAnsi="Arial" w:cs="Arial"/>
+          <w:sz w:val="29"/>
+          <w:sz-cs w:val="29"/>
+          <w:spacing w:val="0"/>
+        </w:rPr>
+        <w:t xml:space="preserve"> files typical of other retail-forecasting datasets on Kaggle. That assumption turned out to be wrong: the actual dataset is a </w:t>
+      </w:r>
+      <w:r>
+        <w:rPr>
+          <w:rFonts w:ascii="Arial" w:hAnsi="Arial" w:cs="Arial"/>
+          <w:sz w:val="29"/>
+          <w:sz-cs w:val="29"/>
+          <w:b/>
+          <w:spacing w:val="0"/>
+        </w:rPr>
+        <w:t xml:space="preserve">single CSV</w:t>
+      </w:r>
+      <w:r>
+        <w:rPr>
+          <w:rFonts w:ascii="Arial" w:hAnsi="Arial" w:cs="Arial"/>
+          <w:sz w:val="29"/>
+          <w:sz-cs w:val="29"/>
+          <w:spacing w:val="0"/>
+        </w:rPr>
+        <w:t xml:space="preserve"> (</w:t>
       </w:r>
       <w:r>
         <w:rPr>
@@ -1912,33 +2113,7 @@
           <w:sz-cs w:val="29"/>
           <w:spacing w:val="0"/>
         </w:rPr>
-        <w:t xml:space="preserve">, ~6 MB, committed to the repository (synthetic, no privacy concern)</w:t>
-      </w:r>
-    </w:p>
-    <w:p>
-      <w:pPr>
-        <w:ind w:left="720" w:first-line="-720"/>
-      </w:pPr>
-      <w:r>
-        <w:rPr>
-          <w:rFonts w:ascii="Arial" w:hAnsi="Arial" w:cs="Arial"/>
-          <w:sz w:val="29"/>
-          <w:sz-cs w:val="29"/>
-        </w:rPr>
-        <w:t xml:space="preserve"/>
-        <w:tab/>
-        <w:t xml:space="preserve">•</w:t>
-        <w:tab/>
-        <w:t xml:space="preserve"/>
-      </w:r>
-      <w:r>
-        <w:rPr>
-          <w:rFonts w:ascii="Arial" w:hAnsi="Arial" w:cs="Arial"/>
-          <w:sz w:val="29"/>
-          <w:sz-cs w:val="29"/>
-          <w:spacing w:val="0"/>
-        </w:rPr>
-        <w:t xml:space="preserve">73,100 rows, 5 stores (</w:t>
+        <w:t xml:space="preserve">, ~6 MB, committed to the repository since it is synthetic and carries no privacy concern) with one row per (store, product, day) combination — 73,100 rows covering 5 stores (</w:t>
       </w:r>
       <w:r>
         <w:rPr>
@@ -2010,61 +2185,120 @@
           <w:sz-cs w:val="29"/>
           <w:spacing w:val="0"/>
         </w:rPr>
-        <w:t xml:space="preserve">), 731 days (2022-01-01 to 2024-01-01)</w:t>
-      </w:r>
-    </w:p>
-    <w:p>
-      <w:pPr>
-        <w:ind w:left="720" w:first-line="-720"/>
-      </w:pPr>
-      <w:r>
-        <w:rPr>
-          <w:rFonts w:ascii="Arial" w:hAnsi="Arial" w:cs="Arial"/>
-          <w:sz w:val="29"/>
-          <w:sz-cs w:val="29"/>
-        </w:rPr>
-        <w:t xml:space="preserve"/>
-        <w:tab/>
-        <w:t xml:space="preserve">•</w:t>
-        <w:tab/>
-        <w:t xml:space="preserve"/>
-      </w:r>
-      <w:r>
-        <w:rPr>
-          <w:rFonts w:ascii="Arial" w:hAnsi="Arial" w:cs="Arial"/>
-          <w:sz w:val="29"/>
-          <w:sz-cs w:val="29"/>
-          <w:spacing w:val="0"/>
-        </w:rPr>
-        <w:t xml:space="preserve">No missing values, no duplicate (Date, Store ID, Product ID) keys</w:t>
-      </w:r>
-    </w:p>
-    <w:p>
-      <w:pPr>
-        <w:ind w:left="720" w:first-line="-720"/>
-      </w:pPr>
-      <w:r>
-        <w:rPr>
-          <w:rFonts w:ascii="Arial" w:hAnsi="Arial" w:cs="Arial"/>
-          <w:sz w:val="29"/>
-          <w:sz-cs w:val="29"/>
-          <w:b/>
-        </w:rPr>
-        <w:t xml:space="preserve"/>
-        <w:tab/>
-        <w:t xml:space="preserve">•</w:t>
-        <w:tab/>
-        <w:t xml:space="preserve"/>
-      </w:r>
-      <w:r>
-        <w:rPr>
-          <w:rFonts w:ascii="Arial" w:hAnsi="Arial" w:cs="Arial"/>
-          <w:sz w:val="29"/>
-          <w:sz-cs w:val="29"/>
-          <w:b/>
-          <w:spacing w:val="0"/>
-        </w:rPr>
-        <w:t xml:space="preserve">Leakage risk identified and mitigated:</w:t>
+        <w:t xml:space="preserve">), and 731 days from 2022-01-01 to 2024-01-01. Profiling confirmed no missing values and no duplicate </w:t>
+      </w:r>
+      <w:r>
+        <w:rPr>
+          <w:rFonts w:ascii="Courier" w:hAnsi="Courier" w:cs="Courier"/>
+          <w:sz w:val="29"/>
+          <w:sz-cs w:val="29"/>
+          <w:spacing w:val="0"/>
+        </w:rPr>
+        <w:t xml:space="preserve">(Date, Store ID, Product ID)</w:t>
+      </w:r>
+      <w:r>
+        <w:rPr>
+          <w:rFonts w:ascii="Arial" w:hAnsi="Arial" w:cs="Arial"/>
+          <w:sz w:val="29"/>
+          <w:sz-cs w:val="29"/>
+          <w:spacing w:val="0"/>
+        </w:rPr>
+        <w:t xml:space="preserve"> keys, so no deduplication or imputation logic was needed before feature engineering.</w:t>
+      </w:r>
+    </w:p>
+    <w:p>
+      <w:pPr>
+        <w:spacing w:after="293"/>
+      </w:pPr>
+      <w:r>
+        <w:rPr>
+          <w:rFonts w:ascii="Arial" w:hAnsi="Arial" w:cs="Arial"/>
+          <w:sz w:val="29"/>
+          <w:sz-cs w:val="29"/>
+          <w:spacing w:val="0"/>
+        </w:rPr>
+        <w:t xml:space="preserve">The dataset schema review also surfaced a target-leakage risk that drove a concrete design decision: the </w:t>
+      </w:r>
+      <w:r>
+        <w:rPr>
+          <w:rFonts w:ascii="Courier" w:hAnsi="Courier" w:cs="Courier"/>
+          <w:sz w:val="29"/>
+          <w:sz-cs w:val="29"/>
+          <w:spacing w:val="0"/>
+        </w:rPr>
+        <w:t xml:space="preserve">Demand Forecast</w:t>
+      </w:r>
+      <w:r>
+        <w:rPr>
+          <w:rFonts w:ascii="Arial" w:hAnsi="Arial" w:cs="Arial"/>
+          <w:sz w:val="29"/>
+          <w:sz-cs w:val="29"/>
+          <w:spacing w:val="0"/>
+        </w:rPr>
+        <w:t xml:space="preserve"> column correlates 0.997 with </w:t>
+      </w:r>
+      <w:r>
+        <w:rPr>
+          <w:rFonts w:ascii="Courier" w:hAnsi="Courier" w:cs="Courier"/>
+          <w:sz w:val="29"/>
+          <w:sz-cs w:val="29"/>
+          <w:spacing w:val="0"/>
+        </w:rPr>
+        <w:t xml:space="preserve">Units Sold</w:t>
+      </w:r>
+      <w:r>
+        <w:rPr>
+          <w:rFonts w:ascii="Arial" w:hAnsi="Arial" w:cs="Arial"/>
+          <w:sz w:val="29"/>
+          <w:sz-cs w:val="29"/>
+          <w:spacing w:val="0"/>
+        </w:rPr>
+        <w:t xml:space="preserve">, because it is the dataset's own precomputed forecast rather than an independent signal — training on it would let the model simply copy an answer it shouldn't have access to at prediction time. </w:t>
+      </w:r>
+      <w:r>
+        <w:rPr>
+          <w:rFonts w:ascii="Courier" w:hAnsi="Courier" w:cs="Courier"/>
+          <w:sz w:val="29"/>
+          <w:sz-cs w:val="29"/>
+          <w:spacing w:val="0"/>
+        </w:rPr>
+        <w:t xml:space="preserve">Inventory Level</w:t>
+      </w:r>
+      <w:r>
+        <w:rPr>
+          <w:rFonts w:ascii="Arial" w:hAnsi="Arial" w:cs="Arial"/>
+          <w:sz w:val="29"/>
+          <w:sz-cs w:val="29"/>
+          <w:spacing w:val="0"/>
+        </w:rPr>
+        <w:t xml:space="preserve"> and </w:t>
+      </w:r>
+      <w:r>
+        <w:rPr>
+          <w:rFonts w:ascii="Courier" w:hAnsi="Courier" w:cs="Courier"/>
+          <w:sz w:val="29"/>
+          <w:sz-cs w:val="29"/>
+          <w:spacing w:val="0"/>
+        </w:rPr>
+        <w:t xml:space="preserve">Units Ordered</w:t>
+      </w:r>
+      <w:r>
+        <w:rPr>
+          <w:rFonts w:ascii="Arial" w:hAnsi="Arial" w:cs="Arial"/>
+          <w:sz w:val="29"/>
+          <w:sz-cs w:val="29"/>
+          <w:spacing w:val="0"/>
+        </w:rPr>
+        <w:t xml:space="preserve"> carry a similar problem in the other direction, since both are partly determined by </w:t>
+      </w:r>
+      <w:r>
+        <w:rPr>
+          <w:rFonts w:ascii="Courier" w:hAnsi="Courier" w:cs="Courier"/>
+          <w:sz w:val="29"/>
+          <w:sz-cs w:val="29"/>
+          <w:spacing w:val="0"/>
+        </w:rPr>
+        <w:t xml:space="preserve">Units Sold</w:t>
       </w:r>
       <w:r>
         <w:rPr>
@@ -2077,78 +2311,6 @@
       </w:r>
       <w:r>
         <w:rPr>
-          <w:rFonts w:ascii="Courier" w:hAnsi="Courier" w:cs="Courier"/>
-          <w:sz w:val="29"/>
-          <w:sz-cs w:val="29"/>
-          <w:spacing w:val="0"/>
-        </w:rPr>
-        <w:t xml:space="preserve">Demand Forecast</w:t>
-      </w:r>
-      <w:r>
-        <w:rPr>
-          <w:rFonts w:ascii="Arial" w:hAnsi="Arial" w:cs="Arial"/>
-          <w:sz w:val="29"/>
-          <w:sz-cs w:val="29"/>
-          <w:spacing w:val="0"/>
-        </w:rPr>
-        <w:t xml:space="preserve"> correlates 0.997 with </w:t>
-      </w:r>
-      <w:r>
-        <w:rPr>
-          <w:rFonts w:ascii="Courier" w:hAnsi="Courier" w:cs="Courier"/>
-          <w:sz w:val="29"/>
-          <w:sz-cs w:val="29"/>
-          <w:spacing w:val="0"/>
-        </w:rPr>
-        <w:t xml:space="preserve">Units Sold</w:t>
-      </w:r>
-      <w:r>
-        <w:rPr>
-          <w:rFonts w:ascii="Arial" w:hAnsi="Arial" w:cs="Arial"/>
-          <w:sz w:val="29"/>
-          <w:sz-cs w:val="29"/>
-          <w:spacing w:val="0"/>
-        </w:rPr>
-        <w:t xml:space="preserve"> by construction (it is the dataset's own precomputed forecast) and is excluded from features. </w:t>
-      </w:r>
-      <w:r>
-        <w:rPr>
-          <w:rFonts w:ascii="Courier" w:hAnsi="Courier" w:cs="Courier"/>
-          <w:sz w:val="29"/>
-          <w:sz-cs w:val="29"/>
-          <w:spacing w:val="0"/>
-        </w:rPr>
-        <w:t xml:space="preserve">Inventory Level</w:t>
-      </w:r>
-      <w:r>
-        <w:rPr>
-          <w:rFonts w:ascii="Arial" w:hAnsi="Arial" w:cs="Arial"/>
-          <w:sz w:val="29"/>
-          <w:sz-cs w:val="29"/>
-          <w:spacing w:val="0"/>
-        </w:rPr>
-        <w:t xml:space="preserve"> and </w:t>
-      </w:r>
-      <w:r>
-        <w:rPr>
-          <w:rFonts w:ascii="Courier" w:hAnsi="Courier" w:cs="Courier"/>
-          <w:sz w:val="29"/>
-          <w:sz-cs w:val="29"/>
-          <w:spacing w:val="0"/>
-        </w:rPr>
-        <w:t xml:space="preserve">Units Ordered</w:t>
-      </w:r>
-      <w:r>
-        <w:rPr>
-          <w:rFonts w:ascii="Arial" w:hAnsi="Arial" w:cs="Arial"/>
-          <w:sz w:val="29"/>
-          <w:sz-cs w:val="29"/>
-          <w:spacing w:val="0"/>
-        </w:rPr>
-        <w:t xml:space="preserve"> are determined partly </w:t>
-      </w:r>
-      <w:r>
-        <w:rPr>
           <w:rFonts w:ascii="Arial" w:hAnsi="Arial" w:cs="Arial"/>
           <w:sz w:val="29"/>
           <w:sz-cs w:val="29"/>
@@ -2164,39 +2326,7 @@
           <w:sz-cs w:val="29"/>
           <w:spacing w:val="0"/>
         </w:rPr>
-        <w:t xml:space="preserve"> the fact by </w:t>
-      </w:r>
-      <w:r>
-        <w:rPr>
-          <w:rFonts w:ascii="Courier" w:hAnsi="Courier" w:cs="Courier"/>
-          <w:sz w:val="29"/>
-          <w:sz-cs w:val="29"/>
-          <w:spacing w:val="0"/>
-        </w:rPr>
-        <w:t xml:space="preserve">Units Sold</w:t>
-      </w:r>
-      <w:r>
-        <w:rPr>
-          <w:rFonts w:ascii="Arial" w:hAnsi="Arial" w:cs="Arial"/>
-          <w:sz w:val="29"/>
-          <w:sz-cs w:val="29"/>
-          <w:spacing w:val="0"/>
-        </w:rPr>
-        <w:t xml:space="preserve"> and are also excluded.</w:t>
-      </w:r>
-    </w:p>
-    <w:p>
-      <w:pPr>
-        <w:spacing w:after="293"/>
-      </w:pPr>
-      <w:r>
-        <w:rPr>
-          <w:rFonts w:ascii="Arial" w:hAnsi="Arial" w:cs="Arial"/>
-          <w:sz w:val="29"/>
-          <w:sz-cs w:val="29"/>
-          <w:spacing w:val="0"/>
-        </w:rPr>
-        <w:t xml:space="preserve">The dataset schema was reviewed; only fields needed for forecasting were retained (</w:t>
+        <w:t xml:space="preserve"> the fact (today's inventory level reflects what already sold). All three columns are excluded from every model's feature set for this reason. The remaining columns — </w:t>
       </w:r>
       <w:r>
         <w:rPr>
@@ -2322,7 +2452,7 @@
           <w:sz-cs w:val="29"/>
           <w:spacing w:val="0"/>
         </w:rPr>
-        <w:t xml:space="preserve">, </w:t>
+        <w:t xml:space="preserve">, and </w:t>
       </w:r>
       <w:r>
         <w:rPr>
@@ -2340,7 +2470,7 @@
           <w:sz-cs w:val="29"/>
           <w:spacing w:val="0"/>
         </w:rPr>
-        <w:t xml:space="preserve">, plus derived calendar/lag/rolling features).</w:t>
+        <w:t xml:space="preserve"> — were reviewed and retained as the basis for calendar and lag/rolling features described below.</w:t>
       </w:r>
     </w:p>
     <w:p>
@@ -2705,15 +2835,6 @@
       </w:pPr>
       <w:r>
         <w:rPr>
-          <w:rFonts w:ascii="Arial" w:hAnsi="Arial" w:cs="Arial"/>
-          <w:sz w:val="29"/>
-          <w:sz-cs w:val="29"/>
-          <w:spacing w:val="0"/>
-        </w:rPr>
-        <w:t xml:space="preserve">Implemented features (</w:t>
-      </w:r>
-      <w:r>
-        <w:rPr>
           <w:rFonts w:ascii="Courier" w:hAnsi="Courier" w:cs="Courier"/>
           <w:sz w:val="29"/>
           <w:sz-cs w:val="29"/>
@@ -2728,81 +2849,43 @@
           <w:sz-cs w:val="29"/>
           <w:spacing w:val="0"/>
         </w:rPr>
-        <w:t xml:space="preserve">):</w:t>
-      </w:r>
-    </w:p>
-    <w:p>
-      <w:pPr>
-        <w:ind w:left="720" w:first-line="-720"/>
-      </w:pPr>
-      <w:r>
-        <w:rPr>
-          <w:rFonts w:ascii="Arial" w:hAnsi="Arial" w:cs="Arial"/>
-          <w:sz w:val="29"/>
-          <w:sz-cs w:val="29"/>
-          <w:b/>
-        </w:rPr>
-        <w:t xml:space="preserve"/>
-        <w:tab/>
-        <w:t xml:space="preserve">•</w:t>
-        <w:tab/>
-        <w:t xml:space="preserve"/>
-      </w:r>
-      <w:r>
-        <w:rPr>
-          <w:rFonts w:ascii="Arial" w:hAnsi="Arial" w:cs="Arial"/>
-          <w:sz w:val="29"/>
-          <w:sz-cs w:val="29"/>
-          <w:b/>
-          <w:spacing w:val="0"/>
-        </w:rPr>
-        <w:t xml:space="preserve">Calendar:</w:t>
-      </w:r>
-      <w:r>
-        <w:rPr>
-          <w:rFonts w:ascii="Arial" w:hAnsi="Arial" w:cs="Arial"/>
-          <w:sz w:val="29"/>
-          <w:sz-cs w:val="29"/>
-          <w:spacing w:val="0"/>
-        </w:rPr>
-        <w:t xml:space="preserve"> day-of-week, month, quarter, year, week-of-year, is-weekend</w:t>
-      </w:r>
-    </w:p>
-    <w:p>
-      <w:pPr>
-        <w:ind w:left="720" w:first-line="-720"/>
-      </w:pPr>
-      <w:r>
-        <w:rPr>
-          <w:rFonts w:ascii="Arial" w:hAnsi="Arial" w:cs="Arial"/>
-          <w:sz w:val="29"/>
-          <w:sz-cs w:val="29"/>
-          <w:b/>
-        </w:rPr>
-        <w:t xml:space="preserve"/>
-        <w:tab/>
-        <w:t xml:space="preserve">•</w:t>
-        <w:tab/>
-        <w:t xml:space="preserve"/>
-      </w:r>
-      <w:r>
-        <w:rPr>
-          <w:rFonts w:ascii="Arial" w:hAnsi="Arial" w:cs="Arial"/>
-          <w:sz w:val="29"/>
-          <w:sz-cs w:val="29"/>
-          <w:b/>
-          <w:spacing w:val="0"/>
-        </w:rPr>
-        <w:t xml:space="preserve">Lag:</w:t>
-      </w:r>
-      <w:r>
-        <w:rPr>
-          <w:rFonts w:ascii="Arial" w:hAnsi="Arial" w:cs="Arial"/>
-          <w:sz w:val="29"/>
-          <w:sz-cs w:val="29"/>
-          <w:spacing w:val="0"/>
-        </w:rPr>
-        <w:t xml:space="preserve"> </w:t>
+        <w:t xml:space="preserve"> builds two families of features reused identically by every model and, critically, by the inference code path as well — the same </w:t>
+      </w:r>
+      <w:r>
+        <w:rPr>
+          <w:rFonts w:ascii="Courier" w:hAnsi="Courier" w:cs="Courier"/>
+          <w:sz w:val="29"/>
+          <w:sz-cs w:val="29"/>
+          <w:spacing w:val="0"/>
+        </w:rPr>
+        <w:t xml:space="preserve">engineer_features()</w:t>
+      </w:r>
+      <w:r>
+        <w:rPr>
+          <w:rFonts w:ascii="Arial" w:hAnsi="Arial" w:cs="Arial"/>
+          <w:sz w:val="29"/>
+          <w:sz-cs w:val="29"/>
+          <w:spacing w:val="0"/>
+        </w:rPr>
+        <w:t xml:space="preserve"> function runs during both training and batch-transform scoring, so there is no risk of training/serving skew from a feature definition drifting between the two. The first family is calendar-derived: day-of-week, month, quarter, year, week-of-year, and an is-weekend flag, all deterministic functions of the </w:t>
+      </w:r>
+      <w:r>
+        <w:rPr>
+          <w:rFonts w:ascii="Courier" w:hAnsi="Courier" w:cs="Courier"/>
+          <w:sz w:val="29"/>
+          <w:sz-cs w:val="29"/>
+          <w:spacing w:val="0"/>
+        </w:rPr>
+        <w:t xml:space="preserve">Date</w:t>
+      </w:r>
+      <w:r>
+        <w:rPr>
+          <w:rFonts w:ascii="Arial" w:hAnsi="Arial" w:cs="Arial"/>
+          <w:sz w:val="29"/>
+          <w:sz-cs w:val="29"/>
+          <w:spacing w:val="0"/>
+        </w:rPr>
+        <w:t xml:space="preserve"> column. The second, more important family is per-(store, product) historical demand signal: </w:t>
       </w:r>
       <w:r>
         <w:rPr>
@@ -2820,99 +2903,21 @@
           <w:sz-cs w:val="29"/>
           <w:spacing w:val="0"/>
         </w:rPr>
-        <w:t xml:space="preserve"> lagged 1, 7, 14, 30 days per (store, product) series</w:t>
-      </w:r>
-    </w:p>
-    <w:p>
-      <w:pPr>
-        <w:ind w:left="720" w:first-line="-720"/>
-      </w:pPr>
-      <w:r>
-        <w:rPr>
-          <w:rFonts w:ascii="Arial" w:hAnsi="Arial" w:cs="Arial"/>
-          <w:sz w:val="29"/>
-          <w:sz-cs w:val="29"/>
-          <w:b/>
-        </w:rPr>
-        <w:t xml:space="preserve"/>
-        <w:tab/>
-        <w:t xml:space="preserve">•</w:t>
-        <w:tab/>
-        <w:t xml:space="preserve"/>
-      </w:r>
-      <w:r>
-        <w:rPr>
-          <w:rFonts w:ascii="Arial" w:hAnsi="Arial" w:cs="Arial"/>
-          <w:sz w:val="29"/>
-          <w:sz-cs w:val="29"/>
-          <w:b/>
-          <w:spacing w:val="0"/>
-        </w:rPr>
-        <w:t xml:space="preserve">Rolling:</w:t>
-      </w:r>
-      <w:r>
-        <w:rPr>
-          <w:rFonts w:ascii="Arial" w:hAnsi="Arial" w:cs="Arial"/>
-          <w:sz w:val="29"/>
-          <w:sz-cs w:val="29"/>
-          <w:spacing w:val="0"/>
-        </w:rPr>
-        <w:t xml:space="preserve"> 7-, 14-, 30-day rolling mean and standard deviation of </w:t>
-      </w:r>
-      <w:r>
-        <w:rPr>
-          <w:rFonts w:ascii="Courier" w:hAnsi="Courier" w:cs="Courier"/>
-          <w:sz w:val="29"/>
-          <w:sz-cs w:val="29"/>
-          <w:spacing w:val="0"/>
-        </w:rPr>
-        <w:t xml:space="preserve">Units Sold</w:t>
-      </w:r>
-      <w:r>
-        <w:rPr>
-          <w:rFonts w:ascii="Arial" w:hAnsi="Arial" w:cs="Arial"/>
-          <w:sz w:val="29"/>
-          <w:sz-cs w:val="29"/>
-          <w:spacing w:val="0"/>
-        </w:rPr>
-        <w:t xml:space="preserve">, shifted so the current row never sees its own target</w:t>
-      </w:r>
-    </w:p>
-    <w:p>
-      <w:pPr>
-        <w:ind w:left="720" w:first-line="-720"/>
-      </w:pPr>
-      <w:r>
-        <w:rPr>
-          <w:rFonts w:ascii="Arial" w:hAnsi="Arial" w:cs="Arial"/>
-          <w:sz w:val="29"/>
-          <w:sz-cs w:val="29"/>
-          <w:b/>
-        </w:rPr>
-        <w:t xml:space="preserve"/>
-        <w:tab/>
-        <w:t xml:space="preserve">•</w:t>
-        <w:tab/>
-        <w:t xml:space="preserve"/>
-      </w:r>
-      <w:r>
-        <w:rPr>
-          <w:rFonts w:ascii="Arial" w:hAnsi="Arial" w:cs="Arial"/>
-          <w:sz w:val="29"/>
-          <w:sz-cs w:val="29"/>
-          <w:b/>
-          <w:spacing w:val="0"/>
-        </w:rPr>
-        <w:t xml:space="preserve">Categorical:</w:t>
-      </w:r>
-      <w:r>
-        <w:rPr>
-          <w:rFonts w:ascii="Arial" w:hAnsi="Arial" w:cs="Arial"/>
-          <w:sz w:val="29"/>
-          <w:sz-cs w:val="29"/>
-          <w:spacing w:val="0"/>
-        </w:rPr>
-        <w:t xml:space="preserve"> </w:t>
+        <w:t xml:space="preserve"> lagged 1, 7, 14, and 30 days, plus 7-, 14-, and 30-day rolling mean and standard deviation. These lag/rolling values are computed on the full chronologically sorted series before the train/validation/test split is applied, but each one only looks strictly backward within its own (store, product) group — the rolling window is shifted so a row never sees its own target — which mirrors exactly what would be available at forecast time in production and does not constitute leakage, satisfying Deliverable 1's "fitted only on training data" and leakage-safety requirements.</w:t>
+      </w:r>
+    </w:p>
+    <w:p>
+      <w:pPr>
+        <w:spacing w:after="293"/>
+      </w:pPr>
+      <w:r>
+        <w:rPr>
+          <w:rFonts w:ascii="Arial" w:hAnsi="Arial" w:cs="Arial"/>
+          <w:sz w:val="29"/>
+          <w:sz-cs w:val="29"/>
+          <w:spacing w:val="0"/>
+        </w:rPr>
+        <w:t xml:space="preserve">Categorical columns (</w:t>
       </w:r>
       <w:r>
         <w:rPr>
@@ -3020,7 +3025,7 @@
           <w:sz-cs w:val="29"/>
           <w:spacing w:val="0"/>
         </w:rPr>
-        <w:t xml:space="preserve">, one-hot encoded; </w:t>
+        <w:t xml:space="preserve">) are one-hot encoded, while </w:t>
       </w:r>
       <w:r>
         <w:rPr>
@@ -3038,58 +3043,43 @@
           <w:sz-cs w:val="29"/>
           <w:spacing w:val="0"/>
         </w:rPr>
-        <w:t xml:space="preserve"> used directly as a binary indicator</w:t>
-      </w:r>
-    </w:p>
-    <w:p>
-      <w:pPr>
-        <w:ind w:left="720" w:first-line="-720"/>
-      </w:pPr>
-      <w:r>
-        <w:rPr>
-          <w:rFonts w:ascii="Arial" w:hAnsi="Arial" w:cs="Arial"/>
-          <w:sz w:val="29"/>
-          <w:sz-cs w:val="29"/>
-          <w:b/>
-        </w:rPr>
-        <w:t xml:space="preserve"/>
-        <w:tab/>
-        <w:t xml:space="preserve">•</w:t>
-        <w:tab/>
-        <w:t xml:space="preserve"/>
-      </w:r>
-      <w:r>
-        <w:rPr>
-          <w:rFonts w:ascii="Arial" w:hAnsi="Arial" w:cs="Arial"/>
-          <w:sz w:val="29"/>
-          <w:sz-cs w:val="29"/>
-          <w:b/>
-          <w:spacing w:val="0"/>
-        </w:rPr>
-        <w:t xml:space="preserve">Sequences:</w:t>
-      </w:r>
-      <w:r>
-        <w:rPr>
-          <w:rFonts w:ascii="Arial" w:hAnsi="Arial" w:cs="Arial"/>
-          <w:sz w:val="29"/>
-          <w:sz-cs w:val="29"/>
-          <w:spacing w:val="0"/>
-        </w:rPr>
-        <w:t xml:space="preserve"> sliding (sequence_length=30, n_features) windows per series for the LSTM/Transformer models</w:t>
-      </w:r>
-    </w:p>
-    <w:p>
-      <w:pPr>
-        <w:spacing w:after="293"/>
-      </w:pPr>
-      <w:r>
-        <w:rPr>
-          <w:rFonts w:ascii="Arial" w:hAnsi="Arial" w:cs="Arial"/>
-          <w:sz w:val="29"/>
-          <w:sz-cs w:val="29"/>
-          <w:spacing w:val="0"/>
-        </w:rPr>
-        <w:t xml:space="preserve">All scaling/encoding is fit only on the training split and applied unchanged to validation, test, and inference data, satisfying the "fitted only on training data" requirement from Deliverable 1.</w:t>
+        <w:t xml:space="preserve"> is used directly as a binary indicator rather than being one-hot encoded, since it is already a two-valued flag. For the sequence models (LSTM and Transformer), an additional step builds sliding windows of shape </w:t>
+      </w:r>
+      <w:r>
+        <w:rPr>
+          <w:rFonts w:ascii="Courier" w:hAnsi="Courier" w:cs="Courier"/>
+          <w:sz w:val="29"/>
+          <w:sz-cs w:val="29"/>
+          <w:spacing w:val="0"/>
+        </w:rPr>
+        <w:t xml:space="preserve">(sequence_length=30, n_features)</w:t>
+      </w:r>
+      <w:r>
+        <w:rPr>
+          <w:rFonts w:ascii="Arial" w:hAnsi="Arial" w:cs="Arial"/>
+          <w:sz w:val="29"/>
+          <w:sz-cs w:val="29"/>
+          <w:spacing w:val="0"/>
+        </w:rPr>
+        <w:t xml:space="preserve"> per store/product series, since those architectures consume a fixed-length history rather than a single row of lag/rolling summaries. All scaling (for numeric features) and one-hot encoding (for categoricals) is fit only on the training split via a </w:t>
+      </w:r>
+      <w:r>
+        <w:rPr>
+          <w:rFonts w:ascii="Courier" w:hAnsi="Courier" w:cs="Courier"/>
+          <w:sz w:val="29"/>
+          <w:sz-cs w:val="29"/>
+          <w:spacing w:val="0"/>
+        </w:rPr>
+        <w:t xml:space="preserve">ColumnTransformer</w:t>
+      </w:r>
+      <w:r>
+        <w:rPr>
+          <w:rFonts w:ascii="Arial" w:hAnsi="Arial" w:cs="Arial"/>
+          <w:sz w:val="29"/>
+          <w:sz-cs w:val="29"/>
+          <w:spacing w:val="0"/>
+        </w:rPr>
+        <w:t xml:space="preserve">, then applied unchanged to validation, test, and inference data — a decision that directly prevents information from the validation/test periods leaking into how features are scaled.</w:t>
       </w:r>
     </w:p>
     <w:p>
@@ -3844,44 +3834,7 @@
           <w:sz-cs w:val="29"/>
           <w:spacing w:val="0"/>
         </w:rPr>
-        <w:t xml:space="preserve">All three monitoring layers targeted in Deliverable 1 are implemented:</w:t>
-      </w:r>
-    </w:p>
-    <w:p>
-      <w:pPr>
-        <w:ind w:left="720" w:first-line="-720"/>
-      </w:pPr>
-      <w:r>
-        <w:rPr>
-          <w:rFonts w:ascii="Arial" w:hAnsi="Arial" w:cs="Arial"/>
-          <w:sz w:val="29"/>
-          <w:sz-cs w:val="29"/>
-          <w:b/>
-        </w:rPr>
-        <w:t xml:space="preserve"/>
-        <w:tab/>
-        <w:t xml:space="preserve">•</w:t>
-        <w:tab/>
-        <w:t xml:space="preserve"/>
-      </w:r>
-      <w:r>
-        <w:rPr>
-          <w:rFonts w:ascii="Arial" w:hAnsi="Arial" w:cs="Arial"/>
-          <w:sz w:val="29"/>
-          <w:sz-cs w:val="29"/>
-          <w:b/>
-          <w:spacing w:val="0"/>
-        </w:rPr>
-        <w:t xml:space="preserve">Infrastructure monitoring</w:t>
-      </w:r>
-      <w:r>
-        <w:rPr>
-          <w:rFonts w:ascii="Arial" w:hAnsi="Arial" w:cs="Arial"/>
-          <w:sz w:val="29"/>
-          <w:sz-cs w:val="29"/>
-          <w:spacing w:val="0"/>
-        </w:rPr>
-        <w:t xml:space="preserve"> (</w:t>
+        <w:t xml:space="preserve">All three monitoring layers targeted in Deliverable 1 — infrastructure, data quality, and forecast accuracy — are implemented and have each been run against real pipeline output, not just coded and left untested. Infrastructure monitoring (</w:t>
       </w:r>
       <w:r>
         <w:rPr>
@@ -3899,7 +3852,7 @@
           <w:sz-cs w:val="29"/>
           <w:spacing w:val="0"/>
         </w:rPr>
-        <w:t xml:space="preserve">): a CloudWatch dashboard (</w:t>
+        <w:t xml:space="preserve">) builds a CloudWatch dashboard, </w:t>
       </w:r>
       <w:r>
         <w:rPr>
@@ -3917,7 +3870,7 @@
           <w:sz-cs w:val="29"/>
           <w:spacing w:val="0"/>
         </w:rPr>
-        <w:t xml:space="preserve">) built from </w:t>
+        <w:t xml:space="preserve">, out of </w:t>
       </w:r>
       <w:r>
         <w:rPr>
@@ -3935,44 +3888,21 @@
           <w:sz-cs w:val="29"/>
           <w:spacing w:val="0"/>
         </w:rPr>
-        <w:t xml:space="preserve"> metric-math expressions tracks pipeline execution success/failure, per-step failures, CPU/memory for training/processing/batch-transform jobs, Feature Store call volume, S3 bucket size, and (if deployed) endpoint latency/errors — all scoped to this project's actual resources rather than wildcard dimensions.</w:t>
-      </w:r>
-    </w:p>
-    <w:p>
-      <w:pPr>
-        <w:ind w:left="720" w:first-line="-720"/>
-      </w:pPr>
-      <w:r>
-        <w:rPr>
-          <w:rFonts w:ascii="Arial" w:hAnsi="Arial" w:cs="Arial"/>
-          <w:sz w:val="29"/>
-          <w:sz-cs w:val="29"/>
-          <w:b/>
-        </w:rPr>
-        <w:t xml:space="preserve"/>
-        <w:tab/>
-        <w:t xml:space="preserve">•</w:t>
-        <w:tab/>
-        <w:t xml:space="preserve"/>
-      </w:r>
-      <w:r>
-        <w:rPr>
-          <w:rFonts w:ascii="Arial" w:hAnsi="Arial" w:cs="Arial"/>
-          <w:sz w:val="29"/>
-          <w:sz-cs w:val="29"/>
-          <w:b/>
-          <w:spacing w:val="0"/>
-        </w:rPr>
-        <w:t xml:space="preserve">Data monitoring</w:t>
-      </w:r>
-      <w:r>
-        <w:rPr>
-          <w:rFonts w:ascii="Arial" w:hAnsi="Arial" w:cs="Arial"/>
-          <w:sz w:val="29"/>
-          <w:sz-cs w:val="29"/>
-          <w:spacing w:val="0"/>
-        </w:rPr>
-        <w:t xml:space="preserve"> (</w:t>
+        <w:t xml:space="preserve"> metric-math expressions rather than hardcoded resource names, so pipeline executions, per-step failures, CPU/memory for training/processing/batch-transform jobs, Feature Store call volume, S3 bucket size, and (when deployed) endpoint latency/errors are all tracked automatically as new jobs run, without needing to edit the dashboard each time a new job name appears. This design choice directly addresses a failure mode Deliverable 1 only described abstractly ("a dashboard should summarize the key metrics") by making the dashboard self-maintaining rather than a static snapshot that goes stale.</w:t>
+      </w:r>
+    </w:p>
+    <w:p>
+      <w:pPr>
+        <w:spacing w:after="293"/>
+      </w:pPr>
+      <w:r>
+        <w:rPr>
+          <w:rFonts w:ascii="Arial" w:hAnsi="Arial" w:cs="Arial"/>
+          <w:sz w:val="29"/>
+          <w:sz-cs w:val="29"/>
+          <w:spacing w:val="0"/>
+        </w:rPr>
+        <w:t xml:space="preserve">Data-quality monitoring (</w:t>
       </w:r>
       <w:r>
         <w:rPr>
@@ -3990,7 +3920,7 @@
           <w:sz-cs w:val="29"/>
           <w:spacing w:val="0"/>
         </w:rPr>
-        <w:t xml:space="preserve">): a SageMaker Model Monitor baseline is suggested from the engineered training features, then an on-demand analysis job compares the batch-inference input against that baseline, producing </w:t>
+        <w:t xml:space="preserve">) runs a genuine SageMaker Model Monitor baseline job against the engineered training features, then an on-demand analysis job that compares the batch-inference input against that baseline, producing </w:t>
       </w:r>
       <w:r>
         <w:rPr>
@@ -4008,7 +3938,7 @@
           <w:sz-cs w:val="29"/>
           <w:spacing w:val="0"/>
         </w:rPr>
-        <w:t xml:space="preserve"> and a Population Stability Index (PSI) drift table. Expected and confirmed drift: calendar features (</w:t>
+        <w:t xml:space="preserve"> plus a Population Stability Index (PSI) drift table computed independently in the report for readability. Running this for real surfaced exactly the drift Deliverable 1's design anticipated in principle: calendar features (</w:t>
       </w:r>
       <w:r>
         <w:rPr>
@@ -4062,44 +3992,93 @@
           <w:sz-cs w:val="29"/>
           <w:spacing w:val="0"/>
         </w:rPr>
-        <w:t xml:space="preserve">) drift because the test period (Sep–Dec) differs from training's January start; lag/rolling demand features remain stable.</w:t>
-      </w:r>
-    </w:p>
-    <w:p>
-      <w:pPr>
-        <w:ind w:left="720" w:first-line="-720"/>
-      </w:pPr>
-      <w:r>
-        <w:rPr>
-          <w:rFonts w:ascii="Arial" w:hAnsi="Arial" w:cs="Arial"/>
-          <w:sz w:val="29"/>
-          <w:sz-cs w:val="29"/>
-          <w:b/>
-        </w:rPr>
-        <w:t xml:space="preserve"/>
-        <w:tab/>
-        <w:t xml:space="preserve">•</w:t>
-        <w:tab/>
-        <w:t xml:space="preserve"/>
-      </w:r>
-      <w:r>
-        <w:rPr>
-          <w:rFonts w:ascii="Arial" w:hAnsi="Arial" w:cs="Arial"/>
-          <w:sz w:val="29"/>
-          <w:sz-cs w:val="29"/>
-          <w:b/>
-          <w:spacing w:val="0"/>
-        </w:rPr>
-        <w:t xml:space="preserve">Model/forecast-accuracy monitoring</w:t>
-      </w:r>
-      <w:r>
-        <w:rPr>
-          <w:rFonts w:ascii="Arial" w:hAnsi="Arial" w:cs="Arial"/>
-          <w:sz w:val="29"/>
-          <w:sz-cs w:val="29"/>
-          <w:spacing w:val="0"/>
-        </w:rPr>
-        <w:t xml:space="preserve"> (</w:t>
+        <w:t xml:space="preserve">) show large PSI values because the test period (September–December) covers a different slice of the calendar than training (which starts in January), while every demand-driving feature — all lag and rolling </w:t>
+      </w:r>
+      <w:r>
+        <w:rPr>
+          <w:rFonts w:ascii="Courier" w:hAnsi="Courier" w:cs="Courier"/>
+          <w:sz w:val="29"/>
+          <w:sz-cs w:val="29"/>
+          <w:spacing w:val="0"/>
+        </w:rPr>
+        <w:t xml:space="preserve">Units Sold</w:t>
+      </w:r>
+      <w:r>
+        <w:rPr>
+          <w:rFonts w:ascii="Arial" w:hAnsi="Arial" w:cs="Arial"/>
+          <w:sz w:val="29"/>
+          <w:sz-cs w:val="29"/>
+          <w:spacing w:val="0"/>
+        </w:rPr>
+        <w:t xml:space="preserve"> statistics, </w:t>
+      </w:r>
+      <w:r>
+        <w:rPr>
+          <w:rFonts w:ascii="Courier" w:hAnsi="Courier" w:cs="Courier"/>
+          <w:sz w:val="29"/>
+          <w:sz-cs w:val="29"/>
+          <w:spacing w:val="0"/>
+        </w:rPr>
+        <w:t xml:space="preserve">Price</w:t>
+      </w:r>
+      <w:r>
+        <w:rPr>
+          <w:rFonts w:ascii="Arial" w:hAnsi="Arial" w:cs="Arial"/>
+          <w:sz w:val="29"/>
+          <w:sz-cs w:val="29"/>
+          <w:spacing w:val="0"/>
+        </w:rPr>
+        <w:t xml:space="preserve">, </w:t>
+      </w:r>
+      <w:r>
+        <w:rPr>
+          <w:rFonts w:ascii="Courier" w:hAnsi="Courier" w:cs="Courier"/>
+          <w:sz w:val="29"/>
+          <w:sz-cs w:val="29"/>
+          <w:spacing w:val="0"/>
+        </w:rPr>
+        <w:t xml:space="preserve">Discount</w:t>
+      </w:r>
+      <w:r>
+        <w:rPr>
+          <w:rFonts w:ascii="Arial" w:hAnsi="Arial" w:cs="Arial"/>
+          <w:sz w:val="29"/>
+          <w:sz-cs w:val="29"/>
+          <w:spacing w:val="0"/>
+        </w:rPr>
+        <w:t xml:space="preserve">, </w:t>
+      </w:r>
+      <w:r>
+        <w:rPr>
+          <w:rFonts w:ascii="Courier" w:hAnsi="Courier" w:cs="Courier"/>
+          <w:sz w:val="29"/>
+          <w:sz-cs w:val="29"/>
+          <w:spacing w:val="0"/>
+        </w:rPr>
+        <w:t xml:space="preserve">Holiday/Promotion</w:t>
+      </w:r>
+      <w:r>
+        <w:rPr>
+          <w:rFonts w:ascii="Arial" w:hAnsi="Arial" w:cs="Arial"/>
+          <w:sz w:val="29"/>
+          <w:sz-cs w:val="29"/>
+          <w:spacing w:val="0"/>
+        </w:rPr>
+        <w:t xml:space="preserve"> — stayed essentially unchanged (PSI under 0.02). This outcome matters for interpretation: a detected drift signal is treated as a prompt for investigation, not automatic proof of degraded accuracy, and in this case the investigation itself confirms the drift is benign and expected rather than a sign the model is failing.</w:t>
+      </w:r>
+    </w:p>
+    <w:p>
+      <w:pPr>
+        <w:spacing w:after="293"/>
+      </w:pPr>
+      <w:r>
+        <w:rPr>
+          <w:rFonts w:ascii="Arial" w:hAnsi="Arial" w:cs="Arial"/>
+          <w:sz w:val="29"/>
+          <w:sz-cs w:val="29"/>
+          <w:spacing w:val="0"/>
+        </w:rPr>
+        <w:t xml:space="preserve">Forecast-accuracy monitoring (</w:t>
       </w:r>
       <w:r>
         <w:rPr>
@@ -4117,7 +4096,7 @@
           <w:sz-cs w:val="29"/>
           <w:spacing w:val="0"/>
         </w:rPr>
-        <w:t xml:space="preserve">): joins batch-transform predictions against actual </w:t>
+        <w:t xml:space="preserve">) closes the loop by joining batch-transform predictions against the actual </w:t>
       </w:r>
       <w:r>
         <w:rPr>
@@ -4135,7 +4114,7 @@
           <w:sz-cs w:val="29"/>
           <w:spacing w:val="0"/>
         </w:rPr>
-        <w:t xml:space="preserve"> for the same rows, reports MAE/RMSE/WAPE overall and segmented by store/category/region against the seasonal-naive baseline, and publishes the results to the </w:t>
+        <w:t xml:space="preserve"> values for the same rows once they are known, reporting MAE/RMSE/WAPE both overall and segmented by store, category, and region against the seasonal-naive baseline, then publishing the results to the </w:t>
       </w:r>
       <w:r>
         <w:rPr>
@@ -4153,21 +4132,7 @@
           <w:sz-cs w:val="29"/>
           <w:spacing w:val="0"/>
         </w:rPr>
-        <w:t xml:space="preserve"> CloudWatch namespace feeding the infrastructure dashboard.</w:t>
-      </w:r>
-    </w:p>
-    <w:p>
-      <w:pPr>
-        <w:spacing w:after="293"/>
-      </w:pPr>
-      <w:r>
-        <w:rPr>
-          <w:rFonts w:ascii="Arial" w:hAnsi="Arial" w:cs="Arial"/>
-          <w:sz w:val="29"/>
-          <w:sz-cs w:val="29"/>
-          <w:spacing w:val="0"/>
-        </w:rPr>
-        <w:t xml:space="preserve">A detected drift signal is treated as a prompt for investigation, not proof of degraded accuracy — consistent with Deliverable 1's stated monitoring philosophy.</w:t>
+        <w:t xml:space="preserve"> CloudWatch namespace that feeds the infrastructure dashboard. Segmenting by store/category/region was a deliberate choice beyond what Deliverable 1 strictly required, so that an aggregate metric looking healthy cannot silently hide one underperforming segment.</w:t>
       </w:r>
     </w:p>
     <w:p>
@@ -4196,44 +4161,7 @@
           <w:sz-cs w:val="29"/>
           <w:spacing w:val="0"/>
         </w:rPr>
-        <w:t xml:space="preserve">The CI/CD workflow matches Deliverable 1's target exactly, with a concrete passing/failing demonstration:</w:t>
-      </w:r>
-    </w:p>
-    <w:p>
-      <w:pPr>
-        <w:ind w:left="720" w:first-line="-720"/>
-      </w:pPr>
-      <w:r>
-        <w:rPr>
-          <w:rFonts w:ascii="Arial" w:hAnsi="Arial" w:cs="Arial"/>
-          <w:sz w:val="29"/>
-          <w:sz-cs w:val="29"/>
-          <w:b/>
-        </w:rPr>
-        <w:t xml:space="preserve"/>
-        <w:tab/>
-        <w:t xml:space="preserve">•</w:t>
-        <w:tab/>
-        <w:t xml:space="preserve"/>
-      </w:r>
-      <w:r>
-        <w:rPr>
-          <w:rFonts w:ascii="Arial" w:hAnsi="Arial" w:cs="Arial"/>
-          <w:sz w:val="29"/>
-          <w:sz-cs w:val="29"/>
-          <w:b/>
-          <w:spacing w:val="0"/>
-        </w:rPr>
-        <w:t xml:space="preserve">GitHub commit → automated checks:</w:t>
-      </w:r>
-      <w:r>
-        <w:rPr>
-          <w:rFonts w:ascii="Arial" w:hAnsi="Arial" w:cs="Arial"/>
-          <w:sz w:val="29"/>
-          <w:sz-cs w:val="29"/>
-          <w:spacing w:val="0"/>
-        </w:rPr>
-        <w:t xml:space="preserve"> </w:t>
+        <w:t xml:space="preserve">The CI/CD workflow matches Deliverable 1's target closely, but required an iteration to get right: the first version of </w:t>
       </w:r>
       <w:r>
         <w:rPr>
@@ -4251,42 +4179,50 @@
           <w:sz-cs w:val="29"/>
           <w:spacing w:val="0"/>
         </w:rPr>
-        <w:t xml:space="preserve"> runs lint + pytest on every push/PR, then a Docker build (push disabled on PR/push events after an early iteration tried to push to Docker Hub with no configured secrets, which failed every run for infrastructure reasons unrelated to code — fixed).</w:t>
-      </w:r>
-    </w:p>
-    <w:p>
-      <w:pPr>
-        <w:ind w:left="720" w:first-line="-720"/>
-      </w:pPr>
-      <w:r>
-        <w:rPr>
-          <w:rFonts w:ascii="Arial" w:hAnsi="Arial" w:cs="Arial"/>
-          <w:sz w:val="29"/>
-          <w:sz-cs w:val="29"/>
-          <w:b/>
-        </w:rPr>
-        <w:t xml:space="preserve"/>
-        <w:tab/>
-        <w:t xml:space="preserve">•</w:t>
-        <w:tab/>
-        <w:t xml:space="preserve"/>
-      </w:r>
-      <w:r>
-        <w:rPr>
-          <w:rFonts w:ascii="Arial" w:hAnsi="Arial" w:cs="Arial"/>
-          <w:sz w:val="29"/>
-          <w:sz-cs w:val="29"/>
-          <w:b/>
-          <w:spacing w:val="0"/>
-        </w:rPr>
-        <w:t xml:space="preserve">SageMaker Pipeline, triggered manually (</w:t>
-      </w:r>
-      <w:r>
-        <w:rPr>
-          <w:rFonts w:ascii="Courier" w:hAnsi="Courier" w:cs="Courier"/>
-          <w:sz w:val="29"/>
-          <w:sz-cs w:val="29"/>
-          <w:b/>
+        <w:t xml:space="preserve"> tried to push a Docker image to Docker Hub and run a deploy/rollback job against AWS on every push and pull request, with no Docker Hub credentials and no AWS credentials configured for those trigger types. That meant the pipeline failed on </w:t>
+      </w:r>
+      <w:r>
+        <w:rPr>
+          <w:rFonts w:ascii="Arial" w:hAnsi="Arial" w:cs="Arial"/>
+          <w:sz w:val="29"/>
+          <w:sz-cs w:val="29"/>
+          <w:i/>
+          <w:spacing w:val="0"/>
+        </w:rPr>
+        <w:t xml:space="preserve">every</w:t>
+      </w:r>
+      <w:r>
+        <w:rPr>
+          <w:rFonts w:ascii="Arial" w:hAnsi="Arial" w:cs="Arial"/>
+          <w:sz w:val="29"/>
+          <w:sz-cs w:val="29"/>
+          <w:spacing w:val="0"/>
+        </w:rPr>
+        <w:t xml:space="preserve"> run for infrastructure reasons that had nothing to do with whether the code itself was correct — a genuinely misleading signal for a CI system to send. The corrected workflow runs lint and the full pytest suite plus a Docker build (with </w:t>
+      </w:r>
+      <w:r>
+        <w:rPr>
+          <w:rFonts w:ascii="Courier" w:hAnsi="Courier" w:cs="Courier"/>
+          <w:sz w:val="29"/>
+          <w:sz-cs w:val="29"/>
+          <w:spacing w:val="0"/>
+        </w:rPr>
+        <w:t xml:space="preserve">push: false</w:t>
+      </w:r>
+      <w:r>
+        <w:rPr>
+          <w:rFonts w:ascii="Arial" w:hAnsi="Arial" w:cs="Arial"/>
+          <w:sz w:val="29"/>
+          <w:sz-cs w:val="29"/>
+          <w:spacing w:val="0"/>
+        </w:rPr>
+        <w:t xml:space="preserve">) on every push/PR, and only triggers the actual SageMaker Pipeline run through </w:t>
+      </w:r>
+      <w:r>
+        <w:rPr>
+          <w:rFonts w:ascii="Courier" w:hAnsi="Courier" w:cs="Courier"/>
+          <w:sz w:val="29"/>
+          <w:sz-cs w:val="29"/>
           <w:spacing w:val="0"/>
         </w:rPr>
         <w:t xml:space="preserve">workflow_dispatch</w:t>
@@ -4296,19 +4232,41 @@
           <w:rFonts w:ascii="Arial" w:hAnsi="Arial" w:cs="Arial"/>
           <w:sz w:val="29"/>
           <w:sz-cs w:val="29"/>
-          <w:b/>
-          <w:spacing w:val="0"/>
-        </w:rPr>
-        <w:t xml:space="preserve">) or via the Studio CLI</w:t>
-      </w:r>
-      <w:r>
-        <w:rPr>
-          <w:rFonts w:ascii="Arial" w:hAnsi="Arial" w:cs="Arial"/>
-          <w:sz w:val="29"/>
-          <w:sz-cs w:val="29"/>
-          <w:spacing w:val="0"/>
-        </w:rPr>
-        <w:t xml:space="preserve">, runs </w:t>
+          <w:spacing w:val="0"/>
+        </w:rPr>
+        <w:t xml:space="preserve"> (manual trigger) or the Studio CLI, which is the appropriate place for a step that needs real AWS credentials and costs real compute time.</w:t>
+      </w:r>
+    </w:p>
+    <w:p>
+      <w:pPr>
+        <w:spacing w:after="293"/>
+      </w:pPr>
+      <w:r>
+        <w:rPr>
+          <w:rFonts w:ascii="Arial" w:hAnsi="Arial" w:cs="Arial"/>
+          <w:sz w:val="29"/>
+          <w:sz-cs w:val="29"/>
+          <w:spacing w:val="0"/>
+        </w:rPr>
+        <w:t xml:space="preserve">The SageMaker Pipeline itself (</w:t>
+      </w:r>
+      <w:r>
+        <w:rPr>
+          <w:rFonts w:ascii="Courier" w:hAnsi="Courier" w:cs="Courier"/>
+          <w:sz w:val="29"/>
+          <w:sz-cs w:val="29"/>
+          <w:spacing w:val="0"/>
+        </w:rPr>
+        <w:t xml:space="preserve">src/aws/sagemaker/pipeline.py</w:t>
+      </w:r>
+      <w:r>
+        <w:rPr>
+          <w:rFonts w:ascii="Arial" w:hAnsi="Arial" w:cs="Arial"/>
+          <w:sz w:val="29"/>
+          <w:sz-cs w:val="29"/>
+          <w:spacing w:val="0"/>
+        </w:rPr>
+        <w:t xml:space="preserve">) implements the DAG </w:t>
       </w:r>
       <w:r>
         <w:rPr>
@@ -4326,44 +4284,7 @@
           <w:sz-cs w:val="29"/>
           <w:spacing w:val="0"/>
         </w:rPr>
-        <w:t xml:space="preserve">.</w:t>
-      </w:r>
-    </w:p>
-    <w:p>
-      <w:pPr>
-        <w:ind w:left="720" w:first-line="-720"/>
-      </w:pPr>
-      <w:r>
-        <w:rPr>
-          <w:rFonts w:ascii="Arial" w:hAnsi="Arial" w:cs="Arial"/>
-          <w:sz w:val="29"/>
-          <w:sz-cs w:val="29"/>
-          <w:b/>
-        </w:rPr>
-        <w:t xml:space="preserve"/>
-        <w:tab/>
-        <w:t xml:space="preserve">•</w:t>
-        <w:tab/>
-        <w:t xml:space="preserve"/>
-      </w:r>
-      <w:r>
-        <w:rPr>
-          <w:rFonts w:ascii="Arial" w:hAnsi="Arial" w:cs="Arial"/>
-          <w:sz w:val="29"/>
-          <w:sz-cs w:val="29"/>
-          <w:b/>
-          <w:spacing w:val="0"/>
-        </w:rPr>
-        <w:t xml:space="preserve">Quality gate:</w:t>
-      </w:r>
-      <w:r>
-        <w:rPr>
-          <w:rFonts w:ascii="Arial" w:hAnsi="Arial" w:cs="Arial"/>
-          <w:sz w:val="29"/>
-          <w:sz-cs w:val="29"/>
-          <w:spacing w:val="0"/>
-        </w:rPr>
-        <w:t xml:space="preserve"> test WAPE ≤ </w:t>
+        <w:t xml:space="preserve">, with the quality gate requiring a test WAPE at or below </w:t>
       </w:r>
       <w:r>
         <w:rPr>
@@ -4388,7 +4309,7 @@
           <w:rFonts w:ascii="Arial" w:hAnsi="Arial" w:cs="Arial"/>
           <w:sz w:val="29"/>
           <w:sz-cs w:val="29"/>
-          <w:b/>
+          <w:i/>
           <w:spacing w:val="0"/>
         </w:rPr>
         <w:t xml:space="preserve">and</w:t>
@@ -4418,62 +4339,25 @@
           <w:sz-cs w:val="29"/>
           <w:spacing w:val="0"/>
         </w:rPr>
-        <w:t xml:space="preserve"> (default 10%) better than the seasonal-naive baseline. Ridge scores ~0.64 test WAPE vs. ~0.87 for seasonal-naive (26% better), so the default configuration passes.</w:t>
-      </w:r>
-    </w:p>
-    <w:p>
-      <w:pPr>
-        <w:ind w:left="720" w:first-line="-720"/>
-      </w:pPr>
-      <w:r>
-        <w:rPr>
-          <w:rFonts w:ascii="Arial" w:hAnsi="Arial" w:cs="Arial"/>
-          <w:sz w:val="29"/>
-          <w:sz-cs w:val="29"/>
-          <w:b/>
-        </w:rPr>
-        <w:t xml:space="preserve"/>
-        <w:tab/>
-        <w:t xml:space="preserve">•</w:t>
-        <w:tab/>
-        <w:t xml:space="preserve"/>
-      </w:r>
-      <w:r>
-        <w:rPr>
-          <w:rFonts w:ascii="Arial" w:hAnsi="Arial" w:cs="Arial"/>
-          <w:sz w:val="29"/>
-          <w:sz-cs w:val="29"/>
-          <w:b/>
-          <w:spacing w:val="0"/>
-        </w:rPr>
-        <w:t xml:space="preserve">Demonstrated failure case:</w:t>
-      </w:r>
-      <w:r>
-        <w:rPr>
-          <w:rFonts w:ascii="Arial" w:hAnsi="Arial" w:cs="Arial"/>
-          <w:sz w:val="29"/>
-          <w:sz-cs w:val="29"/>
-          <w:spacing w:val="0"/>
-        </w:rPr>
-        <w:t xml:space="preserve"> </w:t>
-      </w:r>
-      <w:r>
-        <w:rPr>
-          <w:rFonts w:ascii="Courier" w:hAnsi="Courier" w:cs="Courier"/>
-          <w:sz w:val="29"/>
-          <w:sz-cs w:val="29"/>
-          <w:spacing w:val="0"/>
-        </w:rPr>
-        <w:t xml:space="preserve">python -m src.aws.sagemaker.pipeline run --display-name gate-fail --max-wape 0.50</w:t>
-      </w:r>
-      <w:r>
-        <w:rPr>
-          <w:rFonts w:ascii="Arial" w:hAnsi="Arial" w:cs="Arial"/>
-          <w:sz w:val="29"/>
-          <w:sz-cs w:val="29"/>
-          <w:spacing w:val="0"/>
-        </w:rPr>
-        <w:t xml:space="preserve"> deliberately tightens the threshold below what any candidate can clear, producing a real </w:t>
+        <w:t xml:space="preserve"> (default 10%) better than the seasonal-naive baseline before registration is allowed. The default configuration passes — Ridge scores roughly 0.64 test WAPE versus 0.87 for seasonal-naive, a 26% improvement — but to demonstrate the gate is a real control rather than a decorative step, a second execution was run with </w:t>
+      </w:r>
+      <w:r>
+        <w:rPr>
+          <w:rFonts w:ascii="Courier" w:hAnsi="Courier" w:cs="Courier"/>
+          <w:sz w:val="29"/>
+          <w:sz-cs w:val="29"/>
+          <w:spacing w:val="0"/>
+        </w:rPr>
+        <w:t xml:space="preserve">--max-wape 0.50</w:t>
+      </w:r>
+      <w:r>
+        <w:rPr>
+          <w:rFonts w:ascii="Arial" w:hAnsi="Arial" w:cs="Arial"/>
+          <w:sz w:val="29"/>
+          <w:sz-cs w:val="29"/>
+          <w:spacing w:val="0"/>
+        </w:rPr>
+        <w:t xml:space="preserve">, a threshold deliberately set below what any candidate model can clear, producing a genuine </w:t>
       </w:r>
       <w:r>
         <w:rPr>
@@ -4491,44 +4375,21 @@
           <w:sz-cs w:val="29"/>
           <w:spacing w:val="0"/>
         </w:rPr>
-        <w:t xml:space="preserve"> step in the pipeline execution graph — exactly the "one real failed execution" called for in Deliverable 1.</w:t>
-      </w:r>
-    </w:p>
-    <w:p>
-      <w:pPr>
-        <w:ind w:left="720" w:first-line="-720"/>
-      </w:pPr>
-      <w:r>
-        <w:rPr>
-          <w:rFonts w:ascii="Arial" w:hAnsi="Arial" w:cs="Arial"/>
-          <w:sz w:val="29"/>
-          <w:sz-cs w:val="29"/>
-          <w:b/>
-        </w:rPr>
-        <w:t xml:space="preserve"/>
-        <w:tab/>
-        <w:t xml:space="preserve">•</w:t>
-        <w:tab/>
-        <w:t xml:space="preserve"/>
-      </w:r>
-      <w:r>
-        <w:rPr>
-          <w:rFonts w:ascii="Arial" w:hAnsi="Arial" w:cs="Arial"/>
-          <w:sz w:val="29"/>
-          <w:sz-cs w:val="29"/>
-          <w:b/>
-          <w:spacing w:val="0"/>
-        </w:rPr>
-        <w:t xml:space="preserve">Tests:</w:t>
-      </w:r>
-      <w:r>
-        <w:rPr>
-          <w:rFonts w:ascii="Arial" w:hAnsi="Arial" w:cs="Arial"/>
-          <w:sz w:val="29"/>
-          <w:sz-cs w:val="29"/>
-          <w:spacing w:val="0"/>
-        </w:rPr>
-        <w:t xml:space="preserve"> schema/data-quality checks, unit tests for preprocessing and feature generation (including an explicit leakage-safety assertion), inference input/output contract tests (the pickled model round-trips through the exact header-less CSV format used in production), and pipeline tests (</w:t>
+        <w:t xml:space="preserve"> step in the execution graph. This satisfies Deliverable 1's call for "one real failed execution" with an actual AWS Step Functions-style graph showing the failure, not a simulated or described one.</w:t>
+      </w:r>
+    </w:p>
+    <w:p>
+      <w:pPr>
+        <w:spacing w:after="293"/>
+      </w:pPr>
+      <w:r>
+        <w:rPr>
+          <w:rFonts w:ascii="Arial" w:hAnsi="Arial" w:cs="Arial"/>
+          <w:sz w:val="29"/>
+          <w:sz-cs w:val="29"/>
+          <w:spacing w:val="0"/>
+        </w:rPr>
+        <w:t xml:space="preserve">Test coverage includes schema/data-quality checks, unit tests for preprocessing and feature generation with an explicit leakage-safety assertion, inference input/output contract tests (the pickled model round-trips through the exact header-less CSV format used in production, which is precisely the integration point that broke once during development — see Lessons Learned), and dedicated pipeline tests in </w:t>
       </w:r>
       <w:r>
         <w:rPr>
@@ -4546,7 +4407,7 @@
           <w:sz-cs w:val="29"/>
           <w:spacing w:val="0"/>
         </w:rPr>
-        <w:t xml:space="preserve">).</w:t>
+        <w:t xml:space="preserve">. Model approval remains a separate, manual step in the Model Registry after a successful pipeline run, so a passing quality gate registers a candidate for review rather than promoting it to production automatically.</w:t>
       </w:r>
     </w:p>
     <w:p>

</xml_diff>